<commit_message>
kubernetes - workloads - batch-workloads added
</commit_message>
<xml_diff>
--- a/Kubernetes/concepts/9-batch-workloads.docx
+++ b/Kubernetes/concepts/9-batch-workloads.docx
@@ -1,277 +1,7 @@
 
 <file path=word/document.xml><?xml version="1.0" encoding="utf-8"?>
-<w:document xmlns:wpc="http://schemas.microsoft.com/office/word/2010/wordprocessingCanvas" xmlns:cx="http://schemas.microsoft.com/office/drawing/2014/chartex" xmlns:cx1="http://schemas.microsoft.com/office/drawing/2015/9/8/chartex" xmlns:cx2="http://schemas.microsoft.com/office/drawing/2015/10/21/chartex" xmlns:cx3="http://schemas.microsoft.com/office/drawing/2016/5/9/chartex" xmlns:cx4="http://schemas.microsoft.com/office/drawing/2016/5/10/chartex" xmlns:cx5="http://schemas.microsoft.com/office/drawing/2016/5/11/chartex" xmlns:cx6="http://schemas.microsoft.com/office/drawing/2016/5/12/chartex" xmlns:cx7="http://schemas.microsoft.com/office/drawing/2016/5/13/chartex" xmlns:cx8="http://schemas.microsoft.com/office/drawing/2016/5/14/chartex" xmlns:mc="http://schemas.openxmlformats.org/markup-compatibility/2006" xmlns:aink="http://schemas.microsoft.com/office/drawing/2016/ink" xmlns:am3d="http://schemas.microsoft.com/office/drawing/2017/model3d" xmlns:o="urn:schemas-microsoft-com:office:office" xmlns:oel="http://schemas.microsoft.com/office/2019/extlst" xmlns:r="http://schemas.openxmlformats.org/officeDocument/2006/relationships" xmlns:m="http://schemas.openxmlformats.org/officeDocument/2006/math" xmlns:v="urn:schemas-microsoft-com:vml" xmlns:wp14="http://schemas.microsoft.com/office/word/2010/wordprocessingDrawing" xmlns:wp="http://schemas.openxmlformats.org/drawingml/2006/wordprocessingDrawing" xmlns:w10="urn:schemas-microsoft-com:office:word" xmlns:w="http://schemas.openxmlformats.org/wordprocessingml/2006/main" xmlns:w14="http://schemas.microsoft.com/office/word/2010/wordml" xmlns:w15="http://schemas.microsoft.com/office/word/2012/wordml" xmlns:w16cei="http://schemas.microsoft.com/office/word/2026/wordml/cei" xmlns:w16cex="http://schemas.microsoft.com/office/word/2018/wordml/cex" xmlns:w16cid="http://schemas.microsoft.com/office/word/2016/wordml/cid" xmlns:w16="http://schemas.microsoft.com/office/word/2018/wordml" xmlns:w16du="http://schemas.microsoft.com/office/word/2023/wordml/word16du" xmlns:w16sdtdh="http://schemas.microsoft.com/office/word/2020/wordml/sdtdatahash" xmlns:w16sdtfl="http://schemas.microsoft.com/office/word/2024/wordml/sdtformatlock" xmlns:w16se="http://schemas.microsoft.com/office/word/2015/wordml/symex" xmlns:wpg="http://schemas.microsoft.com/office/word/2010/wordprocessingGroup" xmlns:wpi="http://schemas.microsoft.com/office/word/2010/wordprocessingInk" xmlns:wne="http://schemas.microsoft.com/office/word/2006/wordml" xmlns:wps="http://schemas.microsoft.com/office/word/2010/wordprocessingShape" mc:Ignorable="w14 w15 w16se w16cid w16 w16cex w16sdtdh w16sdtfl w16du wp14">
+<w:document xmlns:wpc="http://schemas.microsoft.com/office/word/2010/wordprocessingCanvas" xmlns:cx="http://schemas.microsoft.com/office/drawing/2014/chartex" xmlns:cx1="http://schemas.microsoft.com/office/drawing/2015/9/8/chartex" xmlns:cx2="http://schemas.microsoft.com/office/drawing/2015/10/21/chartex" xmlns:cx3="http://schemas.microsoft.com/office/drawing/2016/5/9/chartex" xmlns:cx4="http://schemas.microsoft.com/office/drawing/2016/5/10/chartex" xmlns:cx5="http://schemas.microsoft.com/office/drawing/2016/5/11/chartex" xmlns:cx6="http://schemas.microsoft.com/office/drawing/2016/5/12/chartex" xmlns:cx7="http://schemas.microsoft.com/office/drawing/2016/5/13/chartex" xmlns:cx8="http://schemas.microsoft.com/office/drawing/2016/5/14/chartex" xmlns:mc="http://schemas.openxmlformats.org/markup-compatibility/2006" xmlns:aink="http://schemas.microsoft.com/office/drawing/2016/ink" xmlns:am3d="http://schemas.microsoft.com/office/drawing/2017/model3d" xmlns:o="urn:schemas-microsoft-com:office:office" xmlns:oel="http://schemas.microsoft.com/office/2019/extlst" xmlns:r="http://schemas.openxmlformats.org/officeDocument/2006/relationships" xmlns:m="http://schemas.openxmlformats.org/officeDocument/2006/math" xmlns:v="urn:schemas-microsoft-com:vml" xmlns:wp14="http://schemas.microsoft.com/office/word/2010/wordprocessingDrawing" xmlns:wp="http://schemas.openxmlformats.org/drawingml/2006/wordprocessingDrawing" xmlns:w10="urn:schemas-microsoft-com:office:word" xmlns:w="http://schemas.openxmlformats.org/wordprocessingml/2006/main" xmlns:w14="http://schemas.microsoft.com/office/word/2010/wordml" xmlns:w15="http://schemas.microsoft.com/office/word/2012/wordml" xmlns:w16cex="http://schemas.microsoft.com/office/word/2018/wordml/cex" xmlns:w16cid="http://schemas.microsoft.com/office/word/2016/wordml/cid" xmlns:w16="http://schemas.microsoft.com/office/word/2018/wordml" xmlns:w16du="http://schemas.microsoft.com/office/word/2023/wordml/word16du" xmlns:w16sdtdh="http://schemas.microsoft.com/office/word/2020/wordml/sdtdatahash" xmlns:w16sdtfl="http://schemas.microsoft.com/office/word/2024/wordml/sdtformatlock" xmlns:w16se="http://schemas.microsoft.com/office/word/2015/wordml/symex" xmlns:wpg="http://schemas.microsoft.com/office/word/2010/wordprocessingGroup" xmlns:wpi="http://schemas.microsoft.com/office/word/2010/wordprocessingInk" xmlns:wne="http://schemas.microsoft.com/office/word/2006/wordml" xmlns:wps="http://schemas.microsoft.com/office/word/2010/wordprocessingShape" mc:Ignorable="w14 w15 w16se w16cid w16 w16cex w16sdtdh w16sdtfl w16du wp14">
   <w:body>
-    <w:p>
-      <w:pPr>
-        <w:spacing w:after="60"/>
-        <w:jc w:val="both"/>
-        <w:rPr>
-          <w:rFonts w:asciiTheme="majorBidi" w:hAnsiTheme="majorBidi" w:cstheme="majorBidi"/>
-          <w:sz w:val="28"/>
-          <w:szCs w:val="28"/>
-        </w:rPr>
-      </w:pPr>
-      <w:r>
-        <w:rPr>
-          <w:rFonts w:asciiTheme="majorBidi" w:hAnsiTheme="majorBidi" w:cstheme="majorBidi"/>
-          <w:sz w:val="28"/>
-          <w:szCs w:val="28"/>
-        </w:rPr>
-        <w:t xml:space="preserve">In Kubernetes, workloads are generally divided into two major categories: </w:t>
-      </w:r>
-    </w:p>
-    <w:p>
-      <w:pPr>
-        <w:pStyle w:val="ListParagraph"/>
-        <w:numPr>
-          <w:ilvl w:val="0"/>
-          <w:numId w:val="7"/>
-        </w:numPr>
-        <w:spacing w:after="60"/>
-        <w:ind w:left="360"/>
-        <w:jc w:val="both"/>
-        <w:rPr>
-          <w:rFonts w:asciiTheme="majorBidi" w:hAnsiTheme="majorBidi" w:cstheme="majorBidi"/>
-          <w:sz w:val="28"/>
-          <w:szCs w:val="28"/>
-        </w:rPr>
-      </w:pPr>
-      <w:r>
-        <w:rPr>
-          <w:rFonts w:asciiTheme="majorBidi" w:hAnsiTheme="majorBidi" w:cstheme="majorBidi"/>
-          <w:sz w:val="28"/>
-          <w:szCs w:val="28"/>
-        </w:rPr>
-        <w:t xml:space="preserve">long‑running application workloads </w:t>
-      </w:r>
-    </w:p>
-    <w:p>
-      <w:pPr>
-        <w:pStyle w:val="ListParagraph"/>
-        <w:numPr>
-          <w:ilvl w:val="0"/>
-          <w:numId w:val="7"/>
-        </w:numPr>
-        <w:spacing w:after="60"/>
-        <w:ind w:left="360"/>
-        <w:jc w:val="both"/>
-        <w:rPr>
-          <w:rFonts w:asciiTheme="majorBidi" w:hAnsiTheme="majorBidi" w:cstheme="majorBidi"/>
-          <w:sz w:val="28"/>
-          <w:szCs w:val="28"/>
-        </w:rPr>
-      </w:pPr>
-      <w:r>
-        <w:rPr>
-          <w:rFonts w:asciiTheme="majorBidi" w:hAnsiTheme="majorBidi" w:cstheme="majorBidi"/>
-          <w:sz w:val="28"/>
-          <w:szCs w:val="28"/>
-        </w:rPr>
-        <w:t xml:space="preserve">batch workloads </w:t>
-      </w:r>
-    </w:p>
-    <w:p>
-      <w:pPr>
-        <w:spacing w:after="60"/>
-        <w:jc w:val="both"/>
-        <w:rPr>
-          <w:rFonts w:asciiTheme="majorBidi" w:hAnsiTheme="majorBidi" w:cstheme="majorBidi"/>
-          <w:sz w:val="28"/>
-          <w:szCs w:val="28"/>
-        </w:rPr>
-      </w:pPr>
-      <w:r>
-        <w:rPr>
-          <w:rFonts w:asciiTheme="majorBidi" w:hAnsiTheme="majorBidi" w:cstheme="majorBidi"/>
-          <w:sz w:val="28"/>
-          <w:szCs w:val="28"/>
-        </w:rPr>
-        <w:t xml:space="preserve">Controllers such as Deployment, </w:t>
-      </w:r>
-      <w:proofErr w:type="spellStart"/>
-      <w:r>
-        <w:rPr>
-          <w:rFonts w:asciiTheme="majorBidi" w:hAnsiTheme="majorBidi" w:cstheme="majorBidi"/>
-          <w:sz w:val="28"/>
-          <w:szCs w:val="28"/>
-        </w:rPr>
-        <w:t>StatefulSet</w:t>
-      </w:r>
-      <w:proofErr w:type="spellEnd"/>
-      <w:r>
-        <w:rPr>
-          <w:rFonts w:asciiTheme="majorBidi" w:hAnsiTheme="majorBidi" w:cstheme="majorBidi"/>
-          <w:sz w:val="28"/>
-          <w:szCs w:val="28"/>
-        </w:rPr>
-        <w:t xml:space="preserve">, and </w:t>
-      </w:r>
-      <w:proofErr w:type="spellStart"/>
-      <w:r>
-        <w:rPr>
-          <w:rFonts w:asciiTheme="majorBidi" w:hAnsiTheme="majorBidi" w:cstheme="majorBidi"/>
-          <w:sz w:val="28"/>
-          <w:szCs w:val="28"/>
-        </w:rPr>
-        <w:t>DaemonSet</w:t>
-      </w:r>
-      <w:proofErr w:type="spellEnd"/>
-      <w:r>
-        <w:rPr>
-          <w:rFonts w:asciiTheme="majorBidi" w:hAnsiTheme="majorBidi" w:cstheme="majorBidi"/>
-          <w:sz w:val="28"/>
-          <w:szCs w:val="28"/>
-        </w:rPr>
-        <w:t xml:space="preserve"> are designed for long‑running applications. When these resources are created, Kubernetes ensures that their Pods remain running continuously. Their goal is not to complete a task and exit, but to keep the application available for as long as the resource exists. For example, a web server deployed with a Deployment should keep running indefinitely and automatically restart if a Pod fails. These controllers continuously reconcile the cluster state with the desired state, ensuring that the specified number of Pods are always running.</w:t>
-      </w:r>
-    </w:p>
-    <w:p>
-      <w:pPr>
-        <w:spacing w:after="60"/>
-        <w:jc w:val="both"/>
-        <w:rPr>
-          <w:rFonts w:asciiTheme="majorBidi" w:hAnsiTheme="majorBidi" w:cstheme="majorBidi"/>
-          <w:sz w:val="28"/>
-          <w:szCs w:val="28"/>
-        </w:rPr>
-      </w:pPr>
-      <w:r>
-        <w:rPr>
-          <w:rFonts w:asciiTheme="majorBidi" w:hAnsiTheme="majorBidi" w:cstheme="majorBidi"/>
-          <w:sz w:val="28"/>
-          <w:szCs w:val="28"/>
-        </w:rPr>
-        <w:t xml:space="preserve">In contrast, batch workloads such as Job and </w:t>
-      </w:r>
-      <w:proofErr w:type="spellStart"/>
-      <w:r>
-        <w:rPr>
-          <w:rFonts w:asciiTheme="majorBidi" w:hAnsiTheme="majorBidi" w:cstheme="majorBidi"/>
-          <w:sz w:val="28"/>
-          <w:szCs w:val="28"/>
-        </w:rPr>
-        <w:t>CronJob</w:t>
-      </w:r>
-      <w:proofErr w:type="spellEnd"/>
-      <w:r>
-        <w:rPr>
-          <w:rFonts w:asciiTheme="majorBidi" w:hAnsiTheme="majorBidi" w:cstheme="majorBidi"/>
-          <w:sz w:val="28"/>
-          <w:szCs w:val="28"/>
-        </w:rPr>
-        <w:t xml:space="preserve"> are designed for tasks that eventually finish. A Job runs one or more Pods until a specific task completes successfully, after which the Pods terminate and the Job is marked as completed. A </w:t>
-      </w:r>
-      <w:proofErr w:type="spellStart"/>
-      <w:r>
-        <w:rPr>
-          <w:rFonts w:asciiTheme="majorBidi" w:hAnsiTheme="majorBidi" w:cstheme="majorBidi"/>
-          <w:sz w:val="28"/>
-          <w:szCs w:val="28"/>
-        </w:rPr>
-        <w:t>CronJob</w:t>
-      </w:r>
-      <w:proofErr w:type="spellEnd"/>
-      <w:r>
-        <w:rPr>
-          <w:rFonts w:asciiTheme="majorBidi" w:hAnsiTheme="majorBidi" w:cstheme="majorBidi"/>
-          <w:sz w:val="28"/>
-          <w:szCs w:val="28"/>
-        </w:rPr>
-        <w:t xml:space="preserve"> extends this concept by scheduling Jobs to run at specific times or intervals using a </w:t>
-      </w:r>
-      <w:proofErr w:type="spellStart"/>
-      <w:r>
-        <w:rPr>
-          <w:rFonts w:asciiTheme="majorBidi" w:hAnsiTheme="majorBidi" w:cstheme="majorBidi"/>
-          <w:sz w:val="28"/>
-          <w:szCs w:val="28"/>
-        </w:rPr>
-        <w:t>cron</w:t>
-      </w:r>
-      <w:proofErr w:type="spellEnd"/>
-      <w:r>
-        <w:rPr>
-          <w:rFonts w:asciiTheme="majorBidi" w:hAnsiTheme="majorBidi" w:cstheme="majorBidi"/>
-          <w:sz w:val="28"/>
-          <w:szCs w:val="28"/>
-        </w:rPr>
-        <w:t>‑style schedule (for example, running a backup every night at midnight). Unlike application workloads, batch workloads are not meant to run indefinitely; they exist to execute a task, finish successfully, and then stop.</w:t>
-      </w:r>
-    </w:p>
-    <w:p>
-      <w:pPr>
-        <w:spacing w:after="120"/>
-        <w:jc w:val="both"/>
-        <w:rPr>
-          <w:rFonts w:asciiTheme="majorBidi" w:hAnsiTheme="majorBidi" w:cstheme="majorBidi"/>
-          <w:sz w:val="28"/>
-          <w:szCs w:val="28"/>
-        </w:rPr>
-      </w:pPr>
-      <w:r>
-        <w:rPr>
-          <w:rFonts w:asciiTheme="majorBidi" w:hAnsiTheme="majorBidi" w:cstheme="majorBidi"/>
-          <w:sz w:val="28"/>
-          <w:szCs w:val="28"/>
-        </w:rPr>
-        <w:t xml:space="preserve">In summary, application workloads focus on continuous availability and long‑lived processes, while batch workloads focus on task execution and completion. Deployments, </w:t>
-      </w:r>
-      <w:proofErr w:type="spellStart"/>
-      <w:r>
-        <w:rPr>
-          <w:rFonts w:asciiTheme="majorBidi" w:hAnsiTheme="majorBidi" w:cstheme="majorBidi"/>
-          <w:sz w:val="28"/>
-          <w:szCs w:val="28"/>
-        </w:rPr>
-        <w:t>StatefulSets</w:t>
-      </w:r>
-      <w:proofErr w:type="spellEnd"/>
-      <w:r>
-        <w:rPr>
-          <w:rFonts w:asciiTheme="majorBidi" w:hAnsiTheme="majorBidi" w:cstheme="majorBidi"/>
-          <w:sz w:val="28"/>
-          <w:szCs w:val="28"/>
-        </w:rPr>
-        <w:t xml:space="preserve">, and </w:t>
-      </w:r>
-      <w:proofErr w:type="spellStart"/>
-      <w:r>
-        <w:rPr>
-          <w:rFonts w:asciiTheme="majorBidi" w:hAnsiTheme="majorBidi" w:cstheme="majorBidi"/>
-          <w:sz w:val="28"/>
-          <w:szCs w:val="28"/>
-        </w:rPr>
-        <w:t>DaemonSets</w:t>
-      </w:r>
-      <w:proofErr w:type="spellEnd"/>
-      <w:r>
-        <w:rPr>
-          <w:rFonts w:asciiTheme="majorBidi" w:hAnsiTheme="majorBidi" w:cstheme="majorBidi"/>
-          <w:sz w:val="28"/>
-          <w:szCs w:val="28"/>
-        </w:rPr>
-        <w:t xml:space="preserve"> keep applications running and automatically recover from failures, whereas Jobs and </w:t>
-      </w:r>
-      <w:proofErr w:type="spellStart"/>
-      <w:r>
-        <w:rPr>
-          <w:rFonts w:asciiTheme="majorBidi" w:hAnsiTheme="majorBidi" w:cstheme="majorBidi"/>
-          <w:sz w:val="28"/>
-          <w:szCs w:val="28"/>
-        </w:rPr>
-        <w:t>CronJobs</w:t>
-      </w:r>
-      <w:proofErr w:type="spellEnd"/>
-      <w:r>
-        <w:rPr>
-          <w:rFonts w:asciiTheme="majorBidi" w:hAnsiTheme="majorBidi" w:cstheme="majorBidi"/>
-          <w:sz w:val="28"/>
-          <w:szCs w:val="28"/>
-        </w:rPr>
-        <w:t xml:space="preserve"> are used for finite operations such as data processing, database migrations, or scheduled maintenance tasks.</w:t>
-      </w:r>
-    </w:p>
     <w:p>
       <w:pPr>
         <w:spacing w:after="60"/>
@@ -761,7 +491,6 @@
           <w:sz w:val="28"/>
           <w:szCs w:val="28"/>
         </w:rPr>
-        <w:lastRenderedPageBreak/>
         <w:t>backoffLimit</w:t>
       </w:r>
       <w:proofErr w:type="spellEnd"/>
@@ -1034,6 +763,7 @@
           <w:sz w:val="28"/>
           <w:szCs w:val="28"/>
         </w:rPr>
+        <w:lastRenderedPageBreak/>
         <w:t>Job controller creates Pods</w:t>
       </w:r>
     </w:p>
@@ -1604,7 +1334,6 @@
           <w:sz w:val="28"/>
           <w:szCs w:val="28"/>
         </w:rPr>
-        <w:lastRenderedPageBreak/>
         <w:t xml:space="preserve">In a Kubernetes Job workload, what happens when a Pod fails depends on the </w:t>
       </w:r>
       <w:proofErr w:type="spellStart"/>
@@ -2090,7 +1819,6 @@
           <w:sz w:val="32"/>
           <w:szCs w:val="32"/>
         </w:rPr>
-        <w:lastRenderedPageBreak/>
         <w:t>Example YAML</w:t>
       </w:r>
       <w:r>
@@ -2777,7 +2505,7 @@
               </wp:anchor>
             </w:drawing>
           </mc:Choice>
-          <mc:Fallback>
+          <mc:Fallback xmlns:w16cei="http://schemas.microsoft.com/office/word/2026/wordml/cei">
             <w:pict>
               <v:rect w14:anchorId="1265E4DC" id="Rectangle 1" o:spid="_x0000_s1026" style="position:absolute;left:0;text-align:left;margin-left:0;margin-top:.45pt;width:264pt;height:286.5pt;z-index:251659264;visibility:visible;mso-wrap-style:square;mso-width-percent:0;mso-height-percent:0;mso-wrap-distance-left:9pt;mso-wrap-distance-top:0;mso-wrap-distance-right:9pt;mso-wrap-distance-bottom:0;mso-position-horizontal:left;mso-position-horizontal-relative:margin;mso-position-vertical:absolute;mso-position-vertical-relative:text;mso-width-percent:0;mso-height-percent:0;mso-width-relative:margin;mso-height-relative:margin;v-text-anchor:middle" o:gfxdata="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" fillcolor="black [3200]" strokecolor="black [480]" strokeweight="1pt">
                 <v:textbox>
@@ -3631,6 +3359,7 @@
           <w:sz w:val="28"/>
           <w:szCs w:val="28"/>
         </w:rPr>
+        <w:lastRenderedPageBreak/>
         <w:t xml:space="preserve">In a Kubernetes Job, the </w:t>
       </w:r>
       <w:r>
@@ -3949,7 +3678,6 @@
           <w:sz w:val="36"/>
           <w:szCs w:val="36"/>
         </w:rPr>
-        <w:lastRenderedPageBreak/>
         <w:t>Difference Between Init Containers and Jobs</w:t>
       </w:r>
       <w:r>
@@ -4363,6 +4091,7 @@
           <w:sz w:val="28"/>
           <w:szCs w:val="28"/>
         </w:rPr>
+        <w:lastRenderedPageBreak/>
         <w:t>Runs once per Pod start</w:t>
       </w:r>
     </w:p>
@@ -4802,7 +4531,6 @@
           <w:sz w:val="28"/>
           <w:szCs w:val="28"/>
         </w:rPr>
-        <w:lastRenderedPageBreak/>
         <w:t>Runs independently</w:t>
       </w:r>
     </w:p>
@@ -5602,6 +5330,7 @@
                 <w:sz w:val="28"/>
                 <w:szCs w:val="28"/>
               </w:rPr>
+              <w:lastRenderedPageBreak/>
               <w:t>Success requirement</w:t>
             </w:r>
           </w:p>
@@ -5940,7 +5669,6 @@
           <w:sz w:val="48"/>
           <w:szCs w:val="48"/>
         </w:rPr>
-        <w:lastRenderedPageBreak/>
         <w:t>CronJob</w:t>
       </w:r>
       <w:proofErr w:type="spellEnd"/>
@@ -6361,7 +6089,16 @@
           <w:sz w:val="28"/>
           <w:szCs w:val="28"/>
         </w:rPr>
-        <w:t xml:space="preserve"> determines whether multiple Jobs from the same </w:t>
+        <w:t xml:space="preserve"> determines whether multiple Jobs </w:t>
+      </w:r>
+      <w:r>
+        <w:rPr>
+          <w:rFonts w:asciiTheme="majorBidi" w:hAnsiTheme="majorBidi" w:cstheme="majorBidi"/>
+          <w:sz w:val="28"/>
+          <w:szCs w:val="28"/>
+        </w:rPr>
+        <w:lastRenderedPageBreak/>
+        <w:t xml:space="preserve">from the same </w:t>
       </w:r>
       <w:proofErr w:type="spellStart"/>
       <w:r>
@@ -6924,7 +6661,7 @@
               </wp:anchor>
             </w:drawing>
           </mc:Choice>
-          <mc:Fallback>
+          <mc:Fallback xmlns:w16cei="http://schemas.microsoft.com/office/word/2026/wordml/cei">
             <w:pict>
               <v:rect w14:anchorId="2AE22A83" id="Rectangle 2" o:spid="_x0000_s1027" style="position:absolute;left:0;text-align:left;margin-left:0;margin-top:.6pt;width:235.2pt;height:113.25pt;z-index:251660288;visibility:visible;mso-wrap-style:square;mso-width-percent:0;mso-height-percent:0;mso-wrap-distance-left:9pt;mso-wrap-distance-top:0;mso-wrap-distance-right:9pt;mso-wrap-distance-bottom:0;mso-position-horizontal:left;mso-position-horizontal-relative:margin;mso-position-vertical:absolute;mso-position-vertical-relative:text;mso-width-percent:0;mso-height-percent:0;mso-width-relative:margin;mso-height-relative:margin;v-text-anchor:middle" o:gfxdata="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" fillcolor="black [3200]" strokecolor="black [480]" strokeweight="1pt">
                 <v:textbox>
@@ -7112,7 +6849,6 @@
           <w:sz w:val="32"/>
           <w:szCs w:val="32"/>
         </w:rPr>
-        <w:lastRenderedPageBreak/>
         <w:t>Important Fields</w:t>
       </w:r>
       <w:r>
@@ -7678,6 +7414,7 @@
           <w:sz w:val="28"/>
           <w:szCs w:val="28"/>
         </w:rPr>
+        <w:lastRenderedPageBreak/>
         <w:t>startingDeadlineSeconds</w:t>
       </w:r>
       <w:proofErr w:type="spellEnd"/>
@@ -8300,7 +8037,6 @@
           <w:sz w:val="28"/>
           <w:szCs w:val="28"/>
         </w:rPr>
-        <w:lastRenderedPageBreak/>
         <w:t xml:space="preserve">In most clusters, the control plane components (including </w:t>
       </w:r>
       <w:proofErr w:type="spellStart"/>
@@ -8818,6 +8554,7 @@
           <w:sz w:val="28"/>
           <w:szCs w:val="28"/>
         </w:rPr>
+        <w:lastRenderedPageBreak/>
         <w:t>Last time it ran</w:t>
       </w:r>
     </w:p>
@@ -9435,7 +9172,6 @@
           <w:sz w:val="28"/>
           <w:szCs w:val="28"/>
         </w:rPr>
-        <w:lastRenderedPageBreak/>
         <w:t>Jobs may start a few seconds late</w:t>
       </w:r>
     </w:p>
@@ -10373,7 +10109,7 @@
               </wp:anchor>
             </w:drawing>
           </mc:Choice>
-          <mc:Fallback>
+          <mc:Fallback xmlns:w16cei="http://schemas.microsoft.com/office/word/2026/wordml/cei">
             <w:pict>
               <v:rect w14:anchorId="6D9E5079" id="Rectangle 3" o:spid="_x0000_s1028" style="position:absolute;left:0;text-align:left;margin-left:0;margin-top:28.8pt;width:327.6pt;height:289.8pt;z-index:251661312;visibility:visible;mso-wrap-style:square;mso-width-percent:0;mso-height-percent:0;mso-wrap-distance-left:9pt;mso-wrap-distance-top:0;mso-wrap-distance-right:9pt;mso-wrap-distance-bottom:0;mso-position-horizontal:left;mso-position-horizontal-relative:margin;mso-position-vertical:absolute;mso-position-vertical-relative:text;mso-width-percent:0;mso-height-percent:0;mso-width-relative:margin;mso-height-relative:margin;v-text-anchor:middle" o:gfxdata="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" fillcolor="black [3200]" strokecolor="black [480]" strokeweight="1pt">
                 <v:textbox>
@@ -11311,7 +11047,7 @@
 </file>
 
 <file path=word/numbering.xml><?xml version="1.0" encoding="utf-8"?>
-<w:numbering xmlns:wpc="http://schemas.microsoft.com/office/word/2010/wordprocessingCanvas" xmlns:cx="http://schemas.microsoft.com/office/drawing/2014/chartex" xmlns:cx1="http://schemas.microsoft.com/office/drawing/2015/9/8/chartex" xmlns:cx2="http://schemas.microsoft.com/office/drawing/2015/10/21/chartex" xmlns:cx3="http://schemas.microsoft.com/office/drawing/2016/5/9/chartex" xmlns:cx4="http://schemas.microsoft.com/office/drawing/2016/5/10/chartex" xmlns:cx5="http://schemas.microsoft.com/office/drawing/2016/5/11/chartex" xmlns:cx6="http://schemas.microsoft.com/office/drawing/2016/5/12/chartex" xmlns:cx7="http://schemas.microsoft.com/office/drawing/2016/5/13/chartex" xmlns:cx8="http://schemas.microsoft.com/office/drawing/2016/5/14/chartex" xmlns:mc="http://schemas.openxmlformats.org/markup-compatibility/2006" xmlns:aink="http://schemas.microsoft.com/office/drawing/2016/ink" xmlns:am3d="http://schemas.microsoft.com/office/drawing/2017/model3d" xmlns:o="urn:schemas-microsoft-com:office:office" xmlns:oel="http://schemas.microsoft.com/office/2019/extlst" xmlns:r="http://schemas.openxmlformats.org/officeDocument/2006/relationships" xmlns:m="http://schemas.openxmlformats.org/officeDocument/2006/math" xmlns:v="urn:schemas-microsoft-com:vml" xmlns:wp14="http://schemas.microsoft.com/office/word/2010/wordprocessingDrawing" xmlns:wp="http://schemas.openxmlformats.org/drawingml/2006/wordprocessingDrawing" xmlns:w10="urn:schemas-microsoft-com:office:word" xmlns:w="http://schemas.openxmlformats.org/wordprocessingml/2006/main" xmlns:w14="http://schemas.microsoft.com/office/word/2010/wordml" xmlns:w15="http://schemas.microsoft.com/office/word/2012/wordml" xmlns:w16cei="http://schemas.microsoft.com/office/word/2026/wordml/cei" xmlns:w16cex="http://schemas.microsoft.com/office/word/2018/wordml/cex" xmlns:w16cid="http://schemas.microsoft.com/office/word/2016/wordml/cid" xmlns:w16="http://schemas.microsoft.com/office/word/2018/wordml" xmlns:w16du="http://schemas.microsoft.com/office/word/2023/wordml/word16du" xmlns:w16sdtdh="http://schemas.microsoft.com/office/word/2020/wordml/sdtdatahash" xmlns:w16sdtfl="http://schemas.microsoft.com/office/word/2024/wordml/sdtformatlock" xmlns:w16se="http://schemas.microsoft.com/office/word/2015/wordml/symex" xmlns:wpg="http://schemas.microsoft.com/office/word/2010/wordprocessingGroup" xmlns:wpi="http://schemas.microsoft.com/office/word/2010/wordprocessingInk" xmlns:wne="http://schemas.microsoft.com/office/word/2006/wordml" xmlns:wps="http://schemas.microsoft.com/office/word/2010/wordprocessingShape" mc:Ignorable="w14 w15 w16se w16cid w16 w16cex w16sdtdh w16sdtfl w16du wp14">
+<w:numbering xmlns:wpc="http://schemas.microsoft.com/office/word/2010/wordprocessingCanvas" xmlns:cx="http://schemas.microsoft.com/office/drawing/2014/chartex" xmlns:cx1="http://schemas.microsoft.com/office/drawing/2015/9/8/chartex" xmlns:cx2="http://schemas.microsoft.com/office/drawing/2015/10/21/chartex" xmlns:cx3="http://schemas.microsoft.com/office/drawing/2016/5/9/chartex" xmlns:cx4="http://schemas.microsoft.com/office/drawing/2016/5/10/chartex" xmlns:cx5="http://schemas.microsoft.com/office/drawing/2016/5/11/chartex" xmlns:cx6="http://schemas.microsoft.com/office/drawing/2016/5/12/chartex" xmlns:cx7="http://schemas.microsoft.com/office/drawing/2016/5/13/chartex" xmlns:cx8="http://schemas.microsoft.com/office/drawing/2016/5/14/chartex" xmlns:mc="http://schemas.openxmlformats.org/markup-compatibility/2006" xmlns:aink="http://schemas.microsoft.com/office/drawing/2016/ink" xmlns:am3d="http://schemas.microsoft.com/office/drawing/2017/model3d" xmlns:o="urn:schemas-microsoft-com:office:office" xmlns:oel="http://schemas.microsoft.com/office/2019/extlst" xmlns:r="http://schemas.openxmlformats.org/officeDocument/2006/relationships" xmlns:m="http://schemas.openxmlformats.org/officeDocument/2006/math" xmlns:v="urn:schemas-microsoft-com:vml" xmlns:wp14="http://schemas.microsoft.com/office/word/2010/wordprocessingDrawing" xmlns:wp="http://schemas.openxmlformats.org/drawingml/2006/wordprocessingDrawing" xmlns:w10="urn:schemas-microsoft-com:office:word" xmlns:w="http://schemas.openxmlformats.org/wordprocessingml/2006/main" xmlns:w14="http://schemas.microsoft.com/office/word/2010/wordml" xmlns:w15="http://schemas.microsoft.com/office/word/2012/wordml" xmlns:w16cex="http://schemas.microsoft.com/office/word/2018/wordml/cex" xmlns:w16cid="http://schemas.microsoft.com/office/word/2016/wordml/cid" xmlns:w16="http://schemas.microsoft.com/office/word/2018/wordml" xmlns:w16du="http://schemas.microsoft.com/office/word/2023/wordml/word16du" xmlns:w16sdtdh="http://schemas.microsoft.com/office/word/2020/wordml/sdtdatahash" xmlns:w16sdtfl="http://schemas.microsoft.com/office/word/2024/wordml/sdtformatlock" xmlns:w16se="http://schemas.microsoft.com/office/word/2015/wordml/symex" xmlns:wpg="http://schemas.microsoft.com/office/word/2010/wordprocessingGroup" xmlns:wpi="http://schemas.microsoft.com/office/word/2010/wordprocessingInk" xmlns:wne="http://schemas.microsoft.com/office/word/2006/wordml" xmlns:wps="http://schemas.microsoft.com/office/word/2010/wordprocessingShape" mc:Ignorable="w14 w15 w16se w16cid w16 w16cex w16sdtdh w16sdtfl w16du wp14">
   <w:abstractNum w:abstractNumId="0" w15:restartNumberingAfterBreak="0">
     <w:nsid w:val="04C82636"/>
     <w:multiLevelType w:val="hybridMultilevel"/>

</xml_diff>